<commit_message>
docs(paper): cross-reference dan sitasi yang bisa diklik pada versi Word
- Nomor figure/table/persamaan memakai field SEQ + bookmark; rujukan di
  teks memakai REF \h, jadi bisa diklik dan diperbarui dengan F9.
- Sitasi [n] menjadi link internal ke entri daftar pustaka.
- Tabel 2 hanya garis atas, bawah, dan bawah kepala kolom (aturan AIP).
- Paragraf pertama setelah heading ber-indent seperti template.
</commit_message>
<xml_diff>
--- a/docs/Full Paper - EPIC/EPIC2026_FullPaper_Word_AIPCP.docx
+++ b/docs/Full Paper - EPIC/EPIC2026_FullPaper_Word_AIPCP.docx
@@ -200,13 +200,129 @@
     <w:p>
       <w:pPr>
         <w:pStyle w:val="Paragraph"/>
-        <w:ind w:firstLine="0"/>
-      </w:pPr>
-      <w:r>
-        <w:t>Multi-rotor swarms shorten aerial surveys, but real sites are rarely rectangles: they have re-entrant corners, gusty wind, obstacles unknown before take-off, and vehicles that fail. Centroidal Voronoi tessellation (CVT) with Lloyd’s iteration [1] distributes agents over a region and has been combined with obstacles and actuator faults [2], safety constraints [3], non-convex domains [4] and agent dropout [5]; boustrophedon sweeps remain a standard way to cover a cell [6, 7], including cooperative UAV surveys</w:t>
-      </w:r>
-      <w:r>
-        <w:t xml:space="preserve"> [8] with re-planning after failures [9]. Control barrier functions (CBF) enforce safety as a quadratic program (QP) on the input [10, 11], with high-order [12], multi-robot [13] and quadrotor forms for moving obstacles [14] and wind gusts [15]; LQR and </w:t>
+      </w:pPr>
+      <w:r>
+        <w:t>Multi-rotor swarms shorten aerial surveys, but real sites are rarely rectangles: they have re-entrant corners, gusty wind, obstacles unknown before take-off, and vehicles that fail. Centroidal Voronoi tessellation (CVT) with Lloyd’s iteration [</w:t>
+      </w:r>
+      <w:hyperlink w:anchor="_Ref_bib1" w:history="1">
+        <w:r>
+          <w:t>1</w:t>
+        </w:r>
+      </w:hyperlink>
+      <w:r>
+        <w:t>] distributes agents over a region and has been combined with obstacles and actuator faults [</w:t>
+      </w:r>
+      <w:hyperlink w:anchor="_Ref_bib2" w:history="1">
+        <w:r>
+          <w:t>2</w:t>
+        </w:r>
+      </w:hyperlink>
+      <w:r>
+        <w:t>], safety constraints [</w:t>
+      </w:r>
+      <w:hyperlink w:anchor="_Ref_bib3" w:history="1">
+        <w:r>
+          <w:t>3</w:t>
+        </w:r>
+      </w:hyperlink>
+      <w:r>
+        <w:t>], non-convex domains [</w:t>
+      </w:r>
+      <w:hyperlink w:anchor="_Ref_bib4" w:history="1">
+        <w:r>
+          <w:t>4</w:t>
+        </w:r>
+      </w:hyperlink>
+      <w:r>
+        <w:t>] and agent dropout [</w:t>
+      </w:r>
+      <w:hyperlink w:anchor="_Ref_bib5" w:history="1">
+        <w:r>
+          <w:t>5</w:t>
+        </w:r>
+      </w:hyperlink>
+      <w:r>
+        <w:t>]; boustrophedon sweeps remain a standard way to cover a cell [</w:t>
+      </w:r>
+      <w:hyperlink w:anchor="_Ref_bib6" w:history="1">
+        <w:r>
+          <w:t>6</w:t>
+        </w:r>
+      </w:hyperlink>
+      <w:r>
+        <w:t xml:space="preserve">, </w:t>
+      </w:r>
+      <w:hyperlink w:anchor="_Ref_bib7" w:history="1">
+        <w:r>
+          <w:t>7</w:t>
+        </w:r>
+      </w:hyperlink>
+      <w:r>
+        <w:t>], including cooperative UAV surveys [</w:t>
+      </w:r>
+      <w:hyperlink w:anchor="_Ref_bib8" w:history="1">
+        <w:r>
+          <w:t>8</w:t>
+        </w:r>
+      </w:hyperlink>
+      <w:r>
+        <w:t>] with re-planning after failures [</w:t>
+      </w:r>
+      <w:hyperlink w:anchor="_Ref_bib9" w:history="1">
+        <w:r>
+          <w:t>9</w:t>
+        </w:r>
+      </w:hyperlink>
+      <w:r>
+        <w:t>]. Control barrier functions (CBF) enforce safety as a quadratic program (QP) on the input [</w:t>
+      </w:r>
+      <w:hyperlink w:anchor="_Ref_bib10" w:history="1">
+        <w:r>
+          <w:t>10</w:t>
+        </w:r>
+      </w:hyperlink>
+      <w:r>
+        <w:t xml:space="preserve">, </w:t>
+      </w:r>
+      <w:hyperlink w:anchor="_Ref_bib11" w:history="1">
+        <w:r>
+          <w:t>11</w:t>
+        </w:r>
+      </w:hyperlink>
+      <w:r>
+        <w:t>], with high-order [</w:t>
+      </w:r>
+      <w:hyperlink w:anchor="_Ref_bib12" w:history="1">
+        <w:r>
+          <w:t>12</w:t>
+        </w:r>
+      </w:hyperlink>
+      <w:r>
+        <w:t>], multi-robot [</w:t>
+      </w:r>
+      <w:hyperlink w:anchor="_Ref_bib13" w:history="1">
+        <w:r>
+          <w:t>13</w:t>
+        </w:r>
+      </w:hyperlink>
+      <w:r>
+        <w:t>] and quadrotor forms for moving obstacles [</w:t>
+      </w:r>
+      <w:hyperlink w:anchor="_Ref_bib14" w:history="1">
+        <w:r>
+          <w:t>14</w:t>
+        </w:r>
+      </w:hyperlink>
+      <w:r>
+        <w:t>] and wind gusts [</w:t>
+      </w:r>
+      <w:hyperlink w:anchor="_Ref_bib15" w:history="1">
+        <w:r>
+          <w:t>15</w:t>
+        </w:r>
+      </w:hyperlink>
+      <w:r>
+        <w:t xml:space="preserve">]; LQR and </w:t>
       </w:r>
       <w:r>
         <w:rPr>
@@ -221,7 +337,39 @@
         <w:t>∞</w:t>
       </w:r>
       <w:r>
-        <w:t xml:space="preserve"> synthesis remain common for multirotor control under wind [16, 17], and swarm fault tolerance is an active topic [18]. Hierarchical quadcopter swarms with a reactive potential-field planner above cascaded PID loops fly formations through clutter and gusts, yet purely reactive planners remain prone to U-shaped traps [19].</w:t>
+        <w:t xml:space="preserve"> synthesis remain common for multirotor control under wind [</w:t>
+      </w:r>
+      <w:hyperlink w:anchor="_Ref_bib16" w:history="1">
+        <w:r>
+          <w:t>16</w:t>
+        </w:r>
+      </w:hyperlink>
+      <w:r>
+        <w:t xml:space="preserve">, </w:t>
+      </w:r>
+      <w:hyperlink w:anchor="_Ref_bib17" w:history="1">
+        <w:r>
+          <w:t>17</w:t>
+        </w:r>
+      </w:hyperlink>
+      <w:r>
+        <w:t>], and swarm fault tolerance is an active topic [</w:t>
+      </w:r>
+      <w:hyperlink w:anchor="_Ref_bib18" w:history="1">
+        <w:r>
+          <w:t>18</w:t>
+        </w:r>
+      </w:hyperlink>
+      <w:r>
+        <w:t>]. Hierarchical quadcopter swarms with a reactive potential-field planner above cascaded PID loops fly formations through clutter and gusts, yet purely reactive planners remain prone to U-shaped traps [</w:t>
+      </w:r>
+      <w:hyperlink w:anchor="_Ref_bib19" w:history="1">
+        <w:r>
+          <w:t>19</w:t>
+        </w:r>
+      </w:hyperlink>
+      <w:r>
+        <w:t>].</w:t>
       </w:r>
     </w:p>
     <w:p>
@@ -281,14 +429,39 @@
     <w:p>
       <w:pPr>
         <w:pStyle w:val="Paragraph"/>
-        <w:ind w:firstLine="0"/>
-      </w:pPr>
-      <w:r>
-        <w:t xml:space="preserve">Figure 1 shows the three layers, defined per agent: a cell, a lane queue, a safety filter using neighbours within 6 m and obstacles within 10 m, and a flight controller. The upper layers of all agents run in one 20 Hz ROS 2 node [20], sharing </w:t>
+      </w:pPr>
+      <w:r>
+        <w:t>Figure </w:t>
+      </w:r>
+      <w:r>
+        <w:fldChar w:fldCharType="begin"/>
+      </w:r>
+      <w:r>
+        <w:instrText xml:space="preserve"> REF _Ref_fig_arch \h \* MERGEFORMAT </w:instrText>
+      </w:r>
+      <w:r>
+        <w:fldChar w:fldCharType="separate"/>
+      </w:r>
+      <w:r>
+        <w:t>1</w:t>
+      </w:r>
+      <w:r>
+        <w:fldChar w:fldCharType="end"/>
+      </w:r>
+      <w:r>
+        <w:t xml:space="preserve"> shows the three layers, defined per agent: a cell, a lane queue, a safety filter using neighbours within 6 m and obstacles within 10 m, and a flight controller. The upper layers of all agents run in one 20 Hz ROS 2 node [</w:t>
+      </w:r>
+      <w:hyperlink w:anchor="_Ref_bib20" w:history="1">
+        <w:r>
+          <w:t>20</w:t>
+        </w:r>
+      </w:hyperlink>
+      <w:r>
+        <w:t xml:space="preserve">], </w:t>
       </w:r>
       <w:r>
         <w:lastRenderedPageBreak/>
-        <w:t>the coverage grid, obstacle map and failure notices without delay, and each vehicle runs its own 250 Hz low level; distributing the upper layers is future work.</w:t>
+        <w:t>sharing the coverage grid, obstacle map and failure notices without delay, and each vehicle runs its own 250 Hz low level; distributing the upper layers is future work.</w:t>
       </w:r>
     </w:p>
     <w:p>
@@ -300,7 +473,7 @@
           <w:noProof/>
         </w:rPr>
         <w:drawing>
-          <wp:inline distT="0" distB="0" distL="0" distR="0" wp14:anchorId="0F403528" wp14:editId="2D43FDB9">
+          <wp:inline distT="0" distB="0" distL="0" distR="0" wp14:anchorId="4FD48AE9" wp14:editId="27E1E4C3">
             <wp:extent cx="5394960" cy="1757685"/>
             <wp:effectExtent l="0" t="0" r="0" b="0"/>
             <wp:docPr id="1" name="Picture 1"/>
@@ -345,7 +518,46 @@
         <w:rPr>
           <w:b/>
         </w:rPr>
-        <w:t>FIGURE 1.</w:t>
+        <w:t xml:space="preserve">FIGURE </w:t>
+      </w:r>
+      <w:bookmarkStart w:id="0" w:name="_Ref_fig_arch"/>
+      <w:r>
+        <w:rPr>
+          <w:b/>
+        </w:rPr>
+        <w:fldChar w:fldCharType="begin"/>
+      </w:r>
+      <w:r>
+        <w:rPr>
+          <w:b/>
+        </w:rPr>
+        <w:instrText xml:space="preserve"> SEQ Figure \* ARABIC </w:instrText>
+      </w:r>
+      <w:r>
+        <w:rPr>
+          <w:b/>
+        </w:rPr>
+        <w:fldChar w:fldCharType="separate"/>
+      </w:r>
+      <w:r>
+        <w:rPr>
+          <w:b/>
+          <w:noProof/>
+        </w:rPr>
+        <w:t>1</w:t>
+      </w:r>
+      <w:r>
+        <w:rPr>
+          <w:b/>
+        </w:rPr>
+        <w:fldChar w:fldCharType="end"/>
+      </w:r>
+      <w:bookmarkEnd w:id="0"/>
+      <w:r>
+        <w:rPr>
+          <w:b/>
+        </w:rPr>
+        <w:t>.</w:t>
       </w:r>
       <w:r>
         <w:t xml:space="preserve"> </w:t>
@@ -363,7 +575,7 @@
           <w:noProof/>
         </w:rPr>
         <w:drawing>
-          <wp:inline distT="0" distB="0" distL="0" distR="0" wp14:anchorId="246972E8" wp14:editId="7C69F9CE">
+          <wp:inline distT="0" distB="0" distL="0" distR="0" wp14:anchorId="2011D7B2" wp14:editId="678C8CBF">
             <wp:extent cx="5394960" cy="1968687"/>
             <wp:effectExtent l="0" t="0" r="0" b="0"/>
             <wp:docPr id="2" name="Picture 2"/>
@@ -408,7 +620,46 @@
         <w:rPr>
           <w:b/>
         </w:rPr>
-        <w:t>FIGURE 2.</w:t>
+        <w:t xml:space="preserve">FIGURE </w:t>
+      </w:r>
+      <w:bookmarkStart w:id="1" w:name="_Ref_fig_concept_high"/>
+      <w:r>
+        <w:rPr>
+          <w:b/>
+        </w:rPr>
+        <w:fldChar w:fldCharType="begin"/>
+      </w:r>
+      <w:r>
+        <w:rPr>
+          <w:b/>
+        </w:rPr>
+        <w:instrText xml:space="preserve"> SEQ Figure \* ARABIC </w:instrText>
+      </w:r>
+      <w:r>
+        <w:rPr>
+          <w:b/>
+        </w:rPr>
+        <w:fldChar w:fldCharType="separate"/>
+      </w:r>
+      <w:r>
+        <w:rPr>
+          <w:b/>
+          <w:noProof/>
+        </w:rPr>
+        <w:t>2</w:t>
+      </w:r>
+      <w:r>
+        <w:rPr>
+          <w:b/>
+        </w:rPr>
+        <w:fldChar w:fldCharType="end"/>
+      </w:r>
+      <w:bookmarkEnd w:id="1"/>
+      <w:r>
+        <w:rPr>
+          <w:b/>
+        </w:rPr>
+        <w:t>.</w:t>
       </w:r>
       <w:r>
         <w:t xml:space="preserve"> High-level planning in the PID-</w:t>
@@ -440,7 +691,6 @@
     <w:p>
       <w:pPr>
         <w:pStyle w:val="Paragraph"/>
-        <w:ind w:firstLine="0"/>
       </w:pPr>
       <w:r>
         <w:t xml:space="preserve">Given the region polygon </w:t>
@@ -711,7 +961,30 @@
               <w:jc w:val="right"/>
             </w:pPr>
             <w:r>
-              <w:t>(1)</w:t>
+              <w:t>(</w:t>
+            </w:r>
+            <w:bookmarkStart w:id="2" w:name="_Ref_eq_vor"/>
+            <w:r>
+              <w:fldChar w:fldCharType="begin"/>
+            </w:r>
+            <w:r>
+              <w:instrText xml:space="preserve"> SEQ Equation \* ARABIC </w:instrText>
+            </w:r>
+            <w:r>
+              <w:fldChar w:fldCharType="separate"/>
+            </w:r>
+            <w:r>
+              <w:rPr>
+                <w:noProof/>
+              </w:rPr>
+              <w:t>1</w:t>
+            </w:r>
+            <w:r>
+              <w:fldChar w:fldCharType="end"/>
+            </w:r>
+            <w:bookmarkEnd w:id="2"/>
+            <w:r>
+              <w:t>)</w:t>
             </w:r>
           </w:p>
         </w:tc>
@@ -912,7 +1185,33 @@
         </m:r>
       </m:oMath>
       <w:r>
-        <w:t xml:space="preserve"> [1], and agents are assigned to cells by the Hungarian algorithm. Each cell is shrunk by 0.35 m and swept by east–west lanes at most 1.45 m apart; its first and last lanes follow the cell boundary, so the wedges that a fixed-pitch sweep leaves at slanted Voronoi edges are flown too (Fig. 2a). With a sensing radius </w:t>
+        <w:t xml:space="preserve"> [</w:t>
+      </w:r>
+      <w:hyperlink w:anchor="_Ref_bib1" w:history="1">
+        <w:r>
+          <w:t>1</w:t>
+        </w:r>
+      </w:hyperlink>
+      <w:r>
+        <w:t>], and agents are assigned to cells by the Hungarian algorithm. Each cell is shrunk by 0.35 m and swept by east–west lanes at most 1.45 m apart; its first and last lanes follow the cell boundary, so the wedges that a fixed-pitch sweep leaves at slanted Voronoi edges are flown too (Fig. </w:t>
+      </w:r>
+      <w:r>
+        <w:fldChar w:fldCharType="begin"/>
+      </w:r>
+      <w:r>
+        <w:instrText xml:space="preserve"> REF _Ref_fig_concept_high \h \* MERGEFORMAT </w:instrText>
+      </w:r>
+      <w:r>
+        <w:fldChar w:fldCharType="separate"/>
+      </w:r>
+      <w:r>
+        <w:t>2</w:t>
+      </w:r>
+      <w:r>
+        <w:fldChar w:fldCharType="end"/>
+      </w:r>
+      <w:r>
+        <w:t xml:space="preserve">a). With a sensing radius </w:t>
       </w:r>
       <w:r>
         <w:rPr>
@@ -989,7 +1288,25 @@
         <w:t>k</w:t>
       </w:r>
       <w:r>
-        <w:t xml:space="preserve"> (the data of the lost vehicle are treated as lost), merges all failed cells, re-plans lanes over their union and drops lanes that are already at least 80% covered. The helpers are the neighbours of the failed cells closest to the recovery centroid (one for a single loss with at most five lanes, otherwise two, and three after a second loss). They receive contiguous serpentine blocks, which they fly at once if their own cell is finished and append to their queue otherwise (Fig. 2b,c).</w:t>
+        <w:t xml:space="preserve"> (the data of the lost vehicle are treated as lost), merges all failed cells, re-plans lanes over their union and drops lanes that are already at least 80% covered. The helpers are the neighbours of the failed cells closest to the recovery centroid (one for a single loss with at most five lanes, otherwise two, and three after a second loss). They receive contiguous serpentine blocks, which they fly at once if their own cell is finished and append to their queue otherwise (Fig. </w:t>
+      </w:r>
+      <w:r>
+        <w:fldChar w:fldCharType="begin"/>
+      </w:r>
+      <w:r>
+        <w:instrText xml:space="preserve"> REF _Ref_fig_concept_high \h \* MERGEFORMAT </w:instrText>
+      </w:r>
+      <w:r>
+        <w:fldChar w:fldCharType="separate"/>
+      </w:r>
+      <w:r>
+        <w:t>2</w:t>
+      </w:r>
+      <w:r>
+        <w:fldChar w:fldCharType="end"/>
+      </w:r>
+      <w:r>
+        <w:t>b,c).</w:t>
       </w:r>
     </w:p>
     <w:p>
@@ -1004,7 +1321,6 @@
     <w:p>
       <w:pPr>
         <w:pStyle w:val="Paragraph"/>
-        <w:ind w:firstLine="0"/>
       </w:pPr>
       <w:r>
         <w:rPr>
@@ -1688,7 +2004,30 @@
               <w:jc w:val="right"/>
             </w:pPr>
             <w:r>
-              <w:t>(2)</w:t>
+              <w:t>(</w:t>
+            </w:r>
+            <w:bookmarkStart w:id="3" w:name="_Ref_eq_plant"/>
+            <w:r>
+              <w:fldChar w:fldCharType="begin"/>
+            </w:r>
+            <w:r>
+              <w:instrText xml:space="preserve"> SEQ Equation \* ARABIC </w:instrText>
+            </w:r>
+            <w:r>
+              <w:fldChar w:fldCharType="separate"/>
+            </w:r>
+            <w:r>
+              <w:rPr>
+                <w:noProof/>
+              </w:rPr>
+              <w:t>2</w:t>
+            </w:r>
+            <w:r>
+              <w:fldChar w:fldCharType="end"/>
+            </w:r>
+            <w:bookmarkEnd w:id="3"/>
+            <w:r>
+              <w:t>)</w:t>
             </w:r>
           </w:p>
         </w:tc>
@@ -2307,7 +2646,30 @@
               <w:jc w:val="right"/>
             </w:pPr>
             <w:r>
-              <w:t>(3)</w:t>
+              <w:t>(</w:t>
+            </w:r>
+            <w:bookmarkStart w:id="4" w:name="_Ref_eq_phi"/>
+            <w:r>
+              <w:fldChar w:fldCharType="begin"/>
+            </w:r>
+            <w:r>
+              <w:instrText xml:space="preserve"> SEQ Equation \* ARABIC </w:instrText>
+            </w:r>
+            <w:r>
+              <w:fldChar w:fldCharType="separate"/>
+            </w:r>
+            <w:r>
+              <w:rPr>
+                <w:noProof/>
+              </w:rPr>
+              <w:t>3</w:t>
+            </w:r>
+            <w:r>
+              <w:fldChar w:fldCharType="end"/>
+            </w:r>
+            <w:bookmarkEnd w:id="4"/>
+            <w:r>
+              <w:t>)</w:t>
             </w:r>
           </w:p>
         </w:tc>
@@ -2368,7 +2730,25 @@
         <w:t>γh</w:t>
       </w:r>
       <w:r>
-        <w:t xml:space="preserve"> (Fig. 3a); the branch </w:t>
+        <w:t xml:space="preserve"> (Fig. </w:t>
+      </w:r>
+      <w:r>
+        <w:fldChar w:fldCharType="begin"/>
+      </w:r>
+      <w:r>
+        <w:instrText xml:space="preserve"> REF _Ref_fig_concept_cbf \h \* MERGEFORMAT </w:instrText>
+      </w:r>
+      <w:r>
+        <w:fldChar w:fldCharType="separate"/>
+      </w:r>
+      <w:r>
+        <w:t>3</w:t>
+      </w:r>
+      <w:r>
+        <w:fldChar w:fldCharType="end"/>
+      </w:r>
+      <w:r>
+        <w:t xml:space="preserve">a); the branch </w:t>
       </w:r>
       <w:r>
         <w:rPr>
@@ -2868,7 +3248,30 @@
               <w:jc w:val="right"/>
             </w:pPr>
             <w:r>
-              <w:t>(4)</w:t>
+              <w:t>(</w:t>
+            </w:r>
+            <w:bookmarkStart w:id="5" w:name="_Ref_eq_row"/>
+            <w:r>
+              <w:fldChar w:fldCharType="begin"/>
+            </w:r>
+            <w:r>
+              <w:instrText xml:space="preserve"> SEQ Equation \* ARABIC </w:instrText>
+            </w:r>
+            <w:r>
+              <w:fldChar w:fldCharType="separate"/>
+            </w:r>
+            <w:r>
+              <w:rPr>
+                <w:noProof/>
+              </w:rPr>
+              <w:t>4</w:t>
+            </w:r>
+            <w:r>
+              <w:fldChar w:fldCharType="end"/>
+            </w:r>
+            <w:bookmarkEnd w:id="5"/>
+            <w:r>
+              <w:t>)</w:t>
             </w:r>
           </w:p>
         </w:tc>
@@ -2923,7 +3326,10 @@
         <w:t>λ</w:t>
       </w:r>
       <w:r>
-        <w:t xml:space="preserve"> = 1 for obstacles. Neighbour rows are reciprocal (</w:t>
+        <w:t xml:space="preserve"> = 1</w:t>
+      </w:r>
+      <w:r>
+        <w:t xml:space="preserve"> for obstacles. Neighbour rows are reciprocal (</w:t>
       </w:r>
       <w:r>
         <w:rPr>
@@ -2955,10 +3361,7 @@
         <w:t>ji</w:t>
       </w:r>
       <w:r>
-        <w:t xml:space="preserve"> = 1</w:t>
-      </w:r>
-      <w:r>
-        <w:t xml:space="preserve">, weighted by mission state) at a hard radius of 0.70 m and a soft radius of 1.20 m; walls and the end of the current lane give half-plane rows, and inscribed polygons bound the speed (3 m/s) and the per-tick change of </w:t>
+        <w:t xml:space="preserve"> = 1, weighted by mission state) at a hard radius of 0.70 m and a soft radius of 1.20 m; walls and the end of the current lane give half-plane rows, and inscribed polygons bound the speed (3 m/s) and the per-tick change of </w:t>
       </w:r>
       <w:r>
         <w:rPr>
@@ -3328,7 +3731,30 @@
               <w:jc w:val="right"/>
             </w:pPr>
             <w:r>
-              <w:t>(5)</w:t>
+              <w:t>(</w:t>
+            </w:r>
+            <w:bookmarkStart w:id="6" w:name="_Ref_eq_qp"/>
+            <w:r>
+              <w:fldChar w:fldCharType="begin"/>
+            </w:r>
+            <w:r>
+              <w:instrText xml:space="preserve"> SEQ Equation \* ARABIC </w:instrText>
+            </w:r>
+            <w:r>
+              <w:fldChar w:fldCharType="separate"/>
+            </w:r>
+            <w:r>
+              <w:rPr>
+                <w:noProof/>
+              </w:rPr>
+              <w:t>5</w:t>
+            </w:r>
+            <w:r>
+              <w:fldChar w:fldCharType="end"/>
+            </w:r>
+            <w:bookmarkEnd w:id="6"/>
+            <w:r>
+              <w:t>)</w:t>
             </w:r>
           </w:p>
         </w:tc>
@@ -3340,7 +3766,25 @@
         <w:ind w:firstLine="0"/>
       </w:pPr>
       <w:r>
-        <w:t xml:space="preserve">exactly, by enumerating the unconstrained point, the projections onto every row and the pairwise vertices (Fig. 3b). A tangential bias </w:t>
+        <w:t>exactly, by enumerating the unconstrained point, the projections onto every row and the pairwise vertices (Fig. </w:t>
+      </w:r>
+      <w:r>
+        <w:fldChar w:fldCharType="begin"/>
+      </w:r>
+      <w:r>
+        <w:instrText xml:space="preserve"> REF _Ref_fig_concept_cbf \h \* MERGEFORMAT </w:instrText>
+      </w:r>
+      <w:r>
+        <w:fldChar w:fldCharType="separate"/>
+      </w:r>
+      <w:r>
+        <w:t>3</w:t>
+      </w:r>
+      <w:r>
+        <w:fldChar w:fldCharType="end"/>
+      </w:r>
+      <w:r>
+        <w:t xml:space="preserve">b). A tangential bias </w:t>
       </w:r>
       <w:r>
         <w:rPr>
@@ -3349,10 +3793,7 @@
         <w:t>t</w:t>
       </w:r>
       <w:r>
-        <w:t>, applied within a 60</w:t>
-      </w:r>
-      <w:r>
-        <w:t xml:space="preserve">° cone of a head-on approach, breaks symmetric deadlocks and enters only the objective; </w:t>
+        <w:t xml:space="preserve">, applied within a 60° cone of a head-on approach, breaks symmetric deadlocks and enters only the objective; </w:t>
       </w:r>
       <w:r>
         <w:rPr>
@@ -3390,7 +3831,6 @@
     <w:p>
       <w:pPr>
         <w:pStyle w:val="Paragraph"/>
-        <w:ind w:firstLine="0"/>
       </w:pPr>
       <w:r>
         <w:t xml:space="preserve">Each axis is modelled about hover as a double integrator </w:t>
@@ -4025,7 +4465,30 @@
               <w:jc w:val="right"/>
             </w:pPr>
             <w:r>
-              <w:t>(6)</w:t>
+              <w:t>(</w:t>
+            </w:r>
+            <w:bookmarkStart w:id="7" w:name="_Ref_eq_hare"/>
+            <w:r>
+              <w:fldChar w:fldCharType="begin"/>
+            </w:r>
+            <w:r>
+              <w:instrText xml:space="preserve"> SEQ Equation \* ARABIC </w:instrText>
+            </w:r>
+            <w:r>
+              <w:fldChar w:fldCharType="separate"/>
+            </w:r>
+            <w:r>
+              <w:rPr>
+                <w:noProof/>
+              </w:rPr>
+              <w:t>6</w:t>
+            </w:r>
+            <w:r>
+              <w:fldChar w:fldCharType="end"/>
+            </w:r>
+            <w:bookmarkEnd w:id="7"/>
+            <w:r>
+              <w:t>)</w:t>
             </w:r>
           </w:p>
         </w:tc>
@@ -4082,7 +4545,15 @@
         <w:t>a</w:t>
       </w:r>
       <w:r>
-        <w:t xml:space="preserve"> is not Hurwitz [16], with </w:t>
+        <w:t xml:space="preserve"> is not Hurwitz [</w:t>
+      </w:r>
+      <w:hyperlink w:anchor="_Ref_bib16" w:history="1">
+        <w:r>
+          <w:t>16</w:t>
+        </w:r>
+      </w:hyperlink>
+      <w:r>
+        <w:t xml:space="preserve">], with </w:t>
       </w:r>
       <w:r>
         <w:rPr>
@@ -4134,7 +4605,7 @@
         </w:rPr>
         <w:lastRenderedPageBreak/>
         <w:drawing>
-          <wp:inline distT="0" distB="0" distL="0" distR="0" wp14:anchorId="08A157A3" wp14:editId="30ABCF2C">
+          <wp:inline distT="0" distB="0" distL="0" distR="0" wp14:anchorId="1600675C" wp14:editId="288A0472">
             <wp:extent cx="5394960" cy="2026817"/>
             <wp:effectExtent l="0" t="0" r="0" b="0"/>
             <wp:docPr id="3" name="Picture 3"/>
@@ -4179,7 +4650,46 @@
         <w:rPr>
           <w:b/>
         </w:rPr>
-        <w:t>FIGURE 3.</w:t>
+        <w:t xml:space="preserve">FIGURE </w:t>
+      </w:r>
+      <w:bookmarkStart w:id="8" w:name="_Ref_fig_concept_cbf"/>
+      <w:r>
+        <w:rPr>
+          <w:b/>
+        </w:rPr>
+        <w:fldChar w:fldCharType="begin"/>
+      </w:r>
+      <w:r>
+        <w:rPr>
+          <w:b/>
+        </w:rPr>
+        <w:instrText xml:space="preserve"> SEQ Figure \* ARABIC </w:instrText>
+      </w:r>
+      <w:r>
+        <w:rPr>
+          <w:b/>
+        </w:rPr>
+        <w:fldChar w:fldCharType="separate"/>
+      </w:r>
+      <w:r>
+        <w:rPr>
+          <w:b/>
+          <w:noProof/>
+        </w:rPr>
+        <w:t>3</w:t>
+      </w:r>
+      <w:r>
+        <w:rPr>
+          <w:b/>
+        </w:rPr>
+        <w:fldChar w:fldCharType="end"/>
+      </w:r>
+      <w:bookmarkEnd w:id="8"/>
+      <w:r>
+        <w:rPr>
+          <w:b/>
+        </w:rPr>
+        <w:t>.</w:t>
       </w:r>
       <w:r>
         <w:t xml:space="preserve"> Mid-level safety filter with mission parameters. (a) </w:t>
@@ -4200,10 +4710,25 @@
         <w:t>h</w:t>
       </w:r>
       <w:r>
-        <w:t>)</w:t>
-      </w:r>
-      <w:r>
-        <w:t xml:space="preserve"> of Eq. (3) for static rows: zero below </w:t>
+        <w:t>) of Eq. (</w:t>
+      </w:r>
+      <w:r>
+        <w:fldChar w:fldCharType="begin"/>
+      </w:r>
+      <w:r>
+        <w:instrText xml:space="preserve"> REF _Ref_eq_phi \h \* MERGEFORMAT </w:instrText>
+      </w:r>
+      <w:r>
+        <w:fldChar w:fldCharType="separate"/>
+      </w:r>
+      <w:r>
+        <w:t>3</w:t>
+      </w:r>
+      <w:r>
+        <w:fldChar w:fldCharType="end"/>
+      </w:r>
+      <w:r>
+        <w:t xml:space="preserve">) for static rows: zero below </w:t>
       </w:r>
       <w:r>
         <w:rPr>
@@ -4251,7 +4776,7 @@
           <w:noProof/>
         </w:rPr>
         <w:drawing>
-          <wp:inline distT="0" distB="0" distL="0" distR="0" wp14:anchorId="4A37A559" wp14:editId="53CF236B">
+          <wp:inline distT="0" distB="0" distL="0" distR="0" wp14:anchorId="51D962F4" wp14:editId="1BB606CE">
             <wp:extent cx="5394960" cy="1650614"/>
             <wp:effectExtent l="0" t="0" r="0" b="0"/>
             <wp:docPr id="4" name="Picture 4"/>
@@ -4296,13 +4821,49 @@
         <w:rPr>
           <w:b/>
         </w:rPr>
-        <w:t>FIGURE 4.</w:t>
-      </w:r>
-      <w:r>
-        <w:t xml:space="preserve"> </w:t>
-      </w:r>
-      <w:r>
-        <w:t>Signal path of one control step. The coordinator (1)–(3) publishes a set-point and a velocity feed-forward every 50 ms; the flight controller (4)–(7) runs on each 4 ms odometry message. The controllers differ only in the gains of (5)–(6) and in the position integrator (PID-</w:t>
+        <w:t xml:space="preserve">FIGURE </w:t>
+      </w:r>
+      <w:bookmarkStart w:id="9" w:name="_Ref_fig_tick"/>
+      <w:r>
+        <w:rPr>
+          <w:b/>
+        </w:rPr>
+        <w:fldChar w:fldCharType="begin"/>
+      </w:r>
+      <w:r>
+        <w:rPr>
+          <w:b/>
+        </w:rPr>
+        <w:instrText xml:space="preserve"> SEQ Figure \* ARABIC </w:instrText>
+      </w:r>
+      <w:r>
+        <w:rPr>
+          <w:b/>
+        </w:rPr>
+        <w:fldChar w:fldCharType="separate"/>
+      </w:r>
+      <w:r>
+        <w:rPr>
+          <w:b/>
+          <w:noProof/>
+        </w:rPr>
+        <w:t>4</w:t>
+      </w:r>
+      <w:r>
+        <w:rPr>
+          <w:b/>
+        </w:rPr>
+        <w:fldChar w:fldCharType="end"/>
+      </w:r>
+      <w:bookmarkEnd w:id="9"/>
+      <w:r>
+        <w:rPr>
+          <w:b/>
+        </w:rPr>
+        <w:t>.</w:t>
+      </w:r>
+      <w:r>
+        <w:t xml:space="preserve"> Signal path of one control step. The coordinator (1)–(3) publishes a set-point and a velocity feed-forward every 50 ms; the flight controller (4)–(7) runs on each 4 ms odometry message. The controllers differ only in the gains of (5)–(6) and in the position integrator (PID-</w:t>
       </w:r>
       <w:r>
         <w:rPr>
@@ -4317,7 +4878,10 @@
         <w:t>∞</w:t>
       </w:r>
       <w:r>
-        <w:t>: always active, clipped to ±0.6; PID-LQR: active within 0.25 m, clipped to ±0.4).</w:t>
+        <w:t>: always active, clipped to ±0.6</w:t>
+      </w:r>
+      <w:r>
+        <w:t>; PID-LQR: active within 0.25 m, clipped to ±0.4).</w:t>
       </w:r>
     </w:p>
     <w:p>
@@ -4419,10 +4983,43 @@
         <w:t>⊤</w:t>
       </w:r>
       <w:r>
-        <w:t>]</w:t>
-      </w:r>
-      <w:r>
-        <w:t>; the synthesised inner integral gain is not used. Figure 4 shows where the gains enter the signal path of one control step, and Table 1 lists weights, attenuation levels and gains.</w:t>
+        <w:t>]; the synthesised inner integral gain is not used. Figure </w:t>
+      </w:r>
+      <w:r>
+        <w:fldChar w:fldCharType="begin"/>
+      </w:r>
+      <w:r>
+        <w:instrText xml:space="preserve"> REF _Ref_fig_tick \h \* MERGEFORMAT </w:instrText>
+      </w:r>
+      <w:r>
+        <w:fldChar w:fldCharType="separate"/>
+      </w:r>
+      <w:r>
+        <w:t>4</w:t>
+      </w:r>
+      <w:r>
+        <w:fldChar w:fldCharType="end"/>
+      </w:r>
+      <w:r>
+        <w:t xml:space="preserve"> shows where the gains enter the signal path of one control step, and Table </w:t>
+      </w:r>
+      <w:r>
+        <w:fldChar w:fldCharType="begin"/>
+      </w:r>
+      <w:r>
+        <w:instrText xml:space="preserve"> REF _Ref_tab_gains \h \* MERGEFORMAT </w:instrText>
+      </w:r>
+      <w:r>
+        <w:fldChar w:fldCharType="separate"/>
+      </w:r>
+      <w:r>
+        <w:t>1</w:t>
+      </w:r>
+      <w:r>
+        <w:fldChar w:fldCharType="end"/>
+      </w:r>
+      <w:r>
+        <w:t xml:space="preserve"> lists weights, attenuation levels and gains.</w:t>
       </w:r>
     </w:p>
     <w:p>
@@ -4436,7 +5033,6 @@
     <w:p>
       <w:pPr>
         <w:pStyle w:val="Paragraph"/>
-        <w:ind w:firstLine="0"/>
       </w:pPr>
       <w:r>
         <w:t>Seven 3DR Iris quadrotors (</w:t>
@@ -4539,10 +5135,33 @@
         <w:t>2</w:t>
       </w:r>
       <w:r>
-        <w:t>, rotor speed ≤ 1100</w:t>
-      </w:r>
-      <w:r>
-        <w:t xml:space="preserve"> rad/s) are simulated in Gazebo [21] with ROS 2. Controllers read ground-truth odometry; no state estimator is in the loop. Missions start from a launch pad south of the region, cruise at 2.0 m and sweep at 1.6 m/s. Four regions inside a 28×28 m box are used (Fig. 5): </w:t>
+        <w:t>, rotor speed ≤ 1100 rad/s) are simulated in Gazebo [</w:t>
+      </w:r>
+      <w:hyperlink w:anchor="_Ref_bib21" w:history="1">
+        <w:r>
+          <w:t>21</w:t>
+        </w:r>
+      </w:hyperlink>
+      <w:r>
+        <w:t>] with ROS 2. Controllers read ground-truth odometry; no state estimator is in the loop. Missions start from a launch pad south of the region, cruise at 2.0 m and sweep at 1.6 m/s. Four regions inside a 28×28 m box are used (Fig. </w:t>
+      </w:r>
+      <w:r>
+        <w:fldChar w:fldCharType="begin"/>
+      </w:r>
+      <w:r>
+        <w:instrText xml:space="preserve"> REF _Ref_fig_traj \h \* MERGEFORMAT </w:instrText>
+      </w:r>
+      <w:r>
+        <w:fldChar w:fldCharType="separate"/>
+      </w:r>
+      <w:r>
+        <w:t>5</w:t>
+      </w:r>
+      <w:r>
+        <w:fldChar w:fldCharType="end"/>
+      </w:r>
+      <w:r>
+        <w:t xml:space="preserve">): </w:t>
       </w:r>
       <w:r>
         <w:rPr>
@@ -4646,7 +5265,15 @@
         <w:t>σ</w:t>
       </w:r>
       <w:r>
-        <w:t xml:space="preserve"> = 2.5 m/s, correlation time 0.5 s, seed 42), a surrogate for the Dryden and von Kármán models used in quadrotor studies [22], plus a constant −2 m/s mean on both axes from </w:t>
+        <w:t xml:space="preserve"> = 2.5 m/s, correlation time 0.5 s, seed 42), a surrogate for the Dryden and von Kármán models used in quadrotor studies [</w:t>
+      </w:r>
+      <w:hyperlink w:anchor="_Ref_bib22" w:history="1">
+        <w:r>
+          <w:t>22</w:t>
+        </w:r>
+      </w:hyperlink>
+      <w:r>
+        <w:t xml:space="preserve">], plus a constant −2 m/s mean on both axes from </w:t>
       </w:r>
       <w:r>
         <w:rPr>
@@ -4655,7 +5282,10 @@
         <w:t>t</w:t>
       </w:r>
       <w:r>
-        <w:t xml:space="preserve"> = 5 s, uniform in space and applied through the Gazebo wind-effects plugin (vertical component scaled by 0.4). Recorded mean (−2.34,−1.95) m/s, standard deviation (2.45,2.51) m/s, horizontal peaks 12.0 m/s.</w:t>
+        <w:t xml:space="preserve"> = 5</w:t>
+      </w:r>
+      <w:r>
+        <w:t> s, uniform in space and applied through the Gazebo wind-effects plugin (vertical component scaled by 0.4). Recorded mean (−2.34,−1.95) m/s, standard deviation (2.45,2.51) m/s, horizontal peaks 12.0 m/s.</w:t>
       </w:r>
     </w:p>
     <w:p>
@@ -4678,10 +5308,7 @@
         <w:t>r</w:t>
       </w:r>
       <w:r>
-        <w:t xml:space="preserve"> = 0.45</w:t>
-      </w:r>
-      <w:r>
-        <w:t xml:space="preserve"> m) oscillate along the region diagonals with amplitude 10 m (12 m, offset by 1 m, in </w:t>
+        <w:t xml:space="preserve"> = 0.45 m) oscillate along the region diagonals with amplitude 10 m (12 m, offset by 1 m, in </w:t>
       </w:r>
       <w:r>
         <w:rPr>
@@ -4704,7 +5331,25 @@
         <w:t>Agent loss.</w:t>
       </w:r>
       <w:r>
-        <w:t xml:space="preserve"> When coverage first reaches 18% and 32%, one pre-selected agent is killed (rotor speeds set to zero, fail-stop) and the coordinator is notified at once. Victims were chosen to own comparable cells next to the launch pad (Table 2).</w:t>
+        <w:t xml:space="preserve"> When coverage first reaches 18% and 32%, one pre-selected agent is killed (rotor speeds set to zero, fail-stop) and the coordinator is notified at once. Victims were chosen to own comparable cells next to the launch pad (Table </w:t>
+      </w:r>
+      <w:r>
+        <w:fldChar w:fldCharType="begin"/>
+      </w:r>
+      <w:r>
+        <w:instrText xml:space="preserve"> REF _Ref_tab_results \h \* MERGEFORMAT </w:instrText>
+      </w:r>
+      <w:r>
+        <w:fldChar w:fldCharType="separate"/>
+      </w:r>
+      <w:r>
+        <w:t>2</w:t>
+      </w:r>
+      <w:r>
+        <w:fldChar w:fldCharType="end"/>
+      </w:r>
+      <w:r>
+        <w:t>).</w:t>
       </w:r>
     </w:p>
     <w:p>
@@ -4718,7 +5363,46 @@
           <w:b/>
         </w:rPr>
         <w:lastRenderedPageBreak/>
-        <w:t>TABLE 1.</w:t>
+        <w:t xml:space="preserve">TABLE </w:t>
+      </w:r>
+      <w:bookmarkStart w:id="10" w:name="_Ref_tab_gains"/>
+      <w:r>
+        <w:rPr>
+          <w:b/>
+        </w:rPr>
+        <w:fldChar w:fldCharType="begin"/>
+      </w:r>
+      <w:r>
+        <w:rPr>
+          <w:b/>
+        </w:rPr>
+        <w:instrText xml:space="preserve"> SEQ Table \* ARABIC </w:instrText>
+      </w:r>
+      <w:r>
+        <w:rPr>
+          <w:b/>
+        </w:rPr>
+        <w:fldChar w:fldCharType="separate"/>
+      </w:r>
+      <w:r>
+        <w:rPr>
+          <w:b/>
+          <w:noProof/>
+        </w:rPr>
+        <w:t>1</w:t>
+      </w:r>
+      <w:r>
+        <w:rPr>
+          <w:b/>
+        </w:rPr>
+        <w:fldChar w:fldCharType="end"/>
+      </w:r>
+      <w:bookmarkEnd w:id="10"/>
+      <w:r>
+        <w:rPr>
+          <w:b/>
+        </w:rPr>
+        <w:t>.</w:t>
       </w:r>
       <w:r>
         <w:t xml:space="preserve"> Gain synthesis (outer </w:t>
@@ -5962,10 +6646,52 @@
         <w:rPr>
           <w:b/>
         </w:rPr>
-        <w:t>TABLE 2.</w:t>
-      </w:r>
-      <w:r>
-        <w:t xml:space="preserve"> Mission results. </w:t>
+        <w:t xml:space="preserve">TABLE </w:t>
+      </w:r>
+      <w:bookmarkStart w:id="11" w:name="_Ref_tab_results"/>
+      <w:r>
+        <w:rPr>
+          <w:b/>
+        </w:rPr>
+        <w:fldChar w:fldCharType="begin"/>
+      </w:r>
+      <w:r>
+        <w:rPr>
+          <w:b/>
+        </w:rPr>
+        <w:instrText xml:space="preserve"> SEQ Table \* ARABIC </w:instrText>
+      </w:r>
+      <w:r>
+        <w:rPr>
+          <w:b/>
+        </w:rPr>
+        <w:fldChar w:fldCharType="separate"/>
+      </w:r>
+      <w:r>
+        <w:rPr>
+          <w:b/>
+          <w:noProof/>
+        </w:rPr>
+        <w:t>2</w:t>
+      </w:r>
+      <w:r>
+        <w:rPr>
+          <w:b/>
+        </w:rPr>
+        <w:fldChar w:fldCharType="end"/>
+      </w:r>
+      <w:bookmarkEnd w:id="11"/>
+      <w:r>
+        <w:rPr>
+          <w:b/>
+        </w:rPr>
+        <w:t>.</w:t>
+      </w:r>
+      <w:r>
+        <w:t xml:space="preserve"> </w:t>
+      </w:r>
+      <w:r>
+        <w:t xml:space="preserve">Mission results. </w:t>
       </w:r>
       <w:r>
         <w:rPr>
@@ -7114,9 +7840,6 @@
           <w:tcPr>
             <w:tcW w:w="0" w:type="auto"/>
             <w:vMerge w:val="restart"/>
-            <w:tcBorders>
-              <w:top w:val="single" w:sz="4" w:space="0" w:color="000000"/>
-            </w:tcBorders>
             <w:vAlign w:val="center"/>
           </w:tcPr>
           <w:p>
@@ -7136,9 +7859,6 @@
         <w:tc>
           <w:tcPr>
             <w:tcW w:w="0" w:type="auto"/>
-            <w:tcBorders>
-              <w:top w:val="single" w:sz="4" w:space="0" w:color="000000"/>
-            </w:tcBorders>
             <w:vAlign w:val="center"/>
           </w:tcPr>
           <w:p>
@@ -7172,9 +7892,6 @@
         <w:tc>
           <w:tcPr>
             <w:tcW w:w="0" w:type="auto"/>
-            <w:tcBorders>
-              <w:top w:val="single" w:sz="4" w:space="0" w:color="000000"/>
-            </w:tcBorders>
             <w:vAlign w:val="center"/>
           </w:tcPr>
           <w:p>
@@ -7194,9 +7911,6 @@
         <w:tc>
           <w:tcPr>
             <w:tcW w:w="0" w:type="auto"/>
-            <w:tcBorders>
-              <w:top w:val="single" w:sz="4" w:space="0" w:color="000000"/>
-            </w:tcBorders>
             <w:vAlign w:val="center"/>
           </w:tcPr>
           <w:p>
@@ -7216,9 +7930,6 @@
         <w:tc>
           <w:tcPr>
             <w:tcW w:w="0" w:type="auto"/>
-            <w:tcBorders>
-              <w:top w:val="single" w:sz="4" w:space="0" w:color="000000"/>
-            </w:tcBorders>
             <w:vAlign w:val="center"/>
           </w:tcPr>
           <w:p>
@@ -7238,9 +7949,6 @@
         <w:tc>
           <w:tcPr>
             <w:tcW w:w="0" w:type="auto"/>
-            <w:tcBorders>
-              <w:top w:val="single" w:sz="4" w:space="0" w:color="000000"/>
-            </w:tcBorders>
             <w:vAlign w:val="center"/>
           </w:tcPr>
           <w:p>
@@ -7260,9 +7968,6 @@
         <w:tc>
           <w:tcPr>
             <w:tcW w:w="0" w:type="auto"/>
-            <w:tcBorders>
-              <w:top w:val="single" w:sz="4" w:space="0" w:color="000000"/>
-            </w:tcBorders>
             <w:vAlign w:val="center"/>
           </w:tcPr>
           <w:p>
@@ -7282,9 +7987,6 @@
         <w:tc>
           <w:tcPr>
             <w:tcW w:w="0" w:type="auto"/>
-            <w:tcBorders>
-              <w:top w:val="single" w:sz="4" w:space="0" w:color="000000"/>
-            </w:tcBorders>
             <w:vAlign w:val="center"/>
           </w:tcPr>
           <w:p>
@@ -7304,9 +8006,6 @@
         <w:tc>
           <w:tcPr>
             <w:tcW w:w="0" w:type="auto"/>
-            <w:tcBorders>
-              <w:top w:val="single" w:sz="4" w:space="0" w:color="000000"/>
-            </w:tcBorders>
             <w:vAlign w:val="center"/>
           </w:tcPr>
           <w:p>
@@ -7326,9 +8025,6 @@
         <w:tc>
           <w:tcPr>
             <w:tcW w:w="0" w:type="auto"/>
-            <w:tcBorders>
-              <w:top w:val="single" w:sz="4" w:space="0" w:color="000000"/>
-            </w:tcBorders>
             <w:vAlign w:val="center"/>
           </w:tcPr>
           <w:p>
@@ -7348,9 +8044,6 @@
         <w:tc>
           <w:tcPr>
             <w:tcW w:w="0" w:type="auto"/>
-            <w:tcBorders>
-              <w:top w:val="single" w:sz="4" w:space="0" w:color="000000"/>
-            </w:tcBorders>
             <w:vAlign w:val="center"/>
           </w:tcPr>
           <w:p>
@@ -7370,9 +8063,6 @@
         <w:tc>
           <w:tcPr>
             <w:tcW w:w="0" w:type="auto"/>
-            <w:tcBorders>
-              <w:top w:val="single" w:sz="4" w:space="0" w:color="000000"/>
-            </w:tcBorders>
             <w:vAlign w:val="center"/>
           </w:tcPr>
           <w:p>
@@ -7392,9 +8082,6 @@
         <w:tc>
           <w:tcPr>
             <w:tcW w:w="0" w:type="auto"/>
-            <w:tcBorders>
-              <w:top w:val="single" w:sz="4" w:space="0" w:color="000000"/>
-            </w:tcBorders>
             <w:vAlign w:val="center"/>
           </w:tcPr>
           <w:p>
@@ -7414,9 +8101,6 @@
         <w:tc>
           <w:tcPr>
             <w:tcW w:w="0" w:type="auto"/>
-            <w:tcBorders>
-              <w:top w:val="single" w:sz="4" w:space="0" w:color="000000"/>
-            </w:tcBorders>
             <w:vAlign w:val="center"/>
           </w:tcPr>
           <w:p>
@@ -7710,9 +8394,6 @@
           <w:tcPr>
             <w:tcW w:w="0" w:type="auto"/>
             <w:vMerge w:val="restart"/>
-            <w:tcBorders>
-              <w:top w:val="single" w:sz="4" w:space="0" w:color="000000"/>
-            </w:tcBorders>
             <w:vAlign w:val="center"/>
           </w:tcPr>
           <w:p>
@@ -7732,9 +8413,6 @@
         <w:tc>
           <w:tcPr>
             <w:tcW w:w="0" w:type="auto"/>
-            <w:tcBorders>
-              <w:top w:val="single" w:sz="4" w:space="0" w:color="000000"/>
-            </w:tcBorders>
             <w:vAlign w:val="center"/>
           </w:tcPr>
           <w:p>
@@ -7768,9 +8446,6 @@
         <w:tc>
           <w:tcPr>
             <w:tcW w:w="0" w:type="auto"/>
-            <w:tcBorders>
-              <w:top w:val="single" w:sz="4" w:space="0" w:color="000000"/>
-            </w:tcBorders>
             <w:vAlign w:val="center"/>
           </w:tcPr>
           <w:p>
@@ -7790,9 +8465,6 @@
         <w:tc>
           <w:tcPr>
             <w:tcW w:w="0" w:type="auto"/>
-            <w:tcBorders>
-              <w:top w:val="single" w:sz="4" w:space="0" w:color="000000"/>
-            </w:tcBorders>
             <w:vAlign w:val="center"/>
           </w:tcPr>
           <w:p>
@@ -7812,9 +8484,6 @@
         <w:tc>
           <w:tcPr>
             <w:tcW w:w="0" w:type="auto"/>
-            <w:tcBorders>
-              <w:top w:val="single" w:sz="4" w:space="0" w:color="000000"/>
-            </w:tcBorders>
             <w:vAlign w:val="center"/>
           </w:tcPr>
           <w:p>
@@ -7834,9 +8503,6 @@
         <w:tc>
           <w:tcPr>
             <w:tcW w:w="0" w:type="auto"/>
-            <w:tcBorders>
-              <w:top w:val="single" w:sz="4" w:space="0" w:color="000000"/>
-            </w:tcBorders>
             <w:vAlign w:val="center"/>
           </w:tcPr>
           <w:p>
@@ -7856,9 +8522,6 @@
         <w:tc>
           <w:tcPr>
             <w:tcW w:w="0" w:type="auto"/>
-            <w:tcBorders>
-              <w:top w:val="single" w:sz="4" w:space="0" w:color="000000"/>
-            </w:tcBorders>
             <w:vAlign w:val="center"/>
           </w:tcPr>
           <w:p>
@@ -7878,9 +8541,6 @@
         <w:tc>
           <w:tcPr>
             <w:tcW w:w="0" w:type="auto"/>
-            <w:tcBorders>
-              <w:top w:val="single" w:sz="4" w:space="0" w:color="000000"/>
-            </w:tcBorders>
             <w:vAlign w:val="center"/>
           </w:tcPr>
           <w:p>
@@ -7900,9 +8560,6 @@
         <w:tc>
           <w:tcPr>
             <w:tcW w:w="0" w:type="auto"/>
-            <w:tcBorders>
-              <w:top w:val="single" w:sz="4" w:space="0" w:color="000000"/>
-            </w:tcBorders>
             <w:vAlign w:val="center"/>
           </w:tcPr>
           <w:p>
@@ -7922,9 +8579,6 @@
         <w:tc>
           <w:tcPr>
             <w:tcW w:w="0" w:type="auto"/>
-            <w:tcBorders>
-              <w:top w:val="single" w:sz="4" w:space="0" w:color="000000"/>
-            </w:tcBorders>
             <w:vAlign w:val="center"/>
           </w:tcPr>
           <w:p>
@@ -7944,9 +8598,6 @@
         <w:tc>
           <w:tcPr>
             <w:tcW w:w="0" w:type="auto"/>
-            <w:tcBorders>
-              <w:top w:val="single" w:sz="4" w:space="0" w:color="000000"/>
-            </w:tcBorders>
             <w:vAlign w:val="center"/>
           </w:tcPr>
           <w:p>
@@ -7966,9 +8617,6 @@
         <w:tc>
           <w:tcPr>
             <w:tcW w:w="0" w:type="auto"/>
-            <w:tcBorders>
-              <w:top w:val="single" w:sz="4" w:space="0" w:color="000000"/>
-            </w:tcBorders>
             <w:vAlign w:val="center"/>
           </w:tcPr>
           <w:p>
@@ -7988,9 +8636,6 @@
         <w:tc>
           <w:tcPr>
             <w:tcW w:w="0" w:type="auto"/>
-            <w:tcBorders>
-              <w:top w:val="single" w:sz="4" w:space="0" w:color="000000"/>
-            </w:tcBorders>
             <w:vAlign w:val="center"/>
           </w:tcPr>
           <w:p>
@@ -8010,9 +8655,6 @@
         <w:tc>
           <w:tcPr>
             <w:tcW w:w="0" w:type="auto"/>
-            <w:tcBorders>
-              <w:top w:val="single" w:sz="4" w:space="0" w:color="000000"/>
-            </w:tcBorders>
             <w:vAlign w:val="center"/>
           </w:tcPr>
           <w:p>
@@ -8306,9 +8948,6 @@
           <w:tcPr>
             <w:tcW w:w="0" w:type="auto"/>
             <w:vMerge w:val="restart"/>
-            <w:tcBorders>
-              <w:top w:val="single" w:sz="4" w:space="0" w:color="000000"/>
-            </w:tcBorders>
             <w:vAlign w:val="center"/>
           </w:tcPr>
           <w:p>
@@ -8328,9 +8967,6 @@
         <w:tc>
           <w:tcPr>
             <w:tcW w:w="0" w:type="auto"/>
-            <w:tcBorders>
-              <w:top w:val="single" w:sz="4" w:space="0" w:color="000000"/>
-            </w:tcBorders>
             <w:vAlign w:val="center"/>
           </w:tcPr>
           <w:p>
@@ -8364,9 +9000,6 @@
         <w:tc>
           <w:tcPr>
             <w:tcW w:w="0" w:type="auto"/>
-            <w:tcBorders>
-              <w:top w:val="single" w:sz="4" w:space="0" w:color="000000"/>
-            </w:tcBorders>
             <w:vAlign w:val="center"/>
           </w:tcPr>
           <w:p>
@@ -8386,9 +9019,6 @@
         <w:tc>
           <w:tcPr>
             <w:tcW w:w="0" w:type="auto"/>
-            <w:tcBorders>
-              <w:top w:val="single" w:sz="4" w:space="0" w:color="000000"/>
-            </w:tcBorders>
             <w:vAlign w:val="center"/>
           </w:tcPr>
           <w:p>
@@ -8408,9 +9038,6 @@
         <w:tc>
           <w:tcPr>
             <w:tcW w:w="0" w:type="auto"/>
-            <w:tcBorders>
-              <w:top w:val="single" w:sz="4" w:space="0" w:color="000000"/>
-            </w:tcBorders>
             <w:vAlign w:val="center"/>
           </w:tcPr>
           <w:p>
@@ -8430,9 +9057,6 @@
         <w:tc>
           <w:tcPr>
             <w:tcW w:w="0" w:type="auto"/>
-            <w:tcBorders>
-              <w:top w:val="single" w:sz="4" w:space="0" w:color="000000"/>
-            </w:tcBorders>
             <w:vAlign w:val="center"/>
           </w:tcPr>
           <w:p>
@@ -8452,9 +9076,6 @@
         <w:tc>
           <w:tcPr>
             <w:tcW w:w="0" w:type="auto"/>
-            <w:tcBorders>
-              <w:top w:val="single" w:sz="4" w:space="0" w:color="000000"/>
-            </w:tcBorders>
             <w:vAlign w:val="center"/>
           </w:tcPr>
           <w:p>
@@ -8474,9 +9095,6 @@
         <w:tc>
           <w:tcPr>
             <w:tcW w:w="0" w:type="auto"/>
-            <w:tcBorders>
-              <w:top w:val="single" w:sz="4" w:space="0" w:color="000000"/>
-            </w:tcBorders>
             <w:vAlign w:val="center"/>
           </w:tcPr>
           <w:p>
@@ -8496,9 +9114,6 @@
         <w:tc>
           <w:tcPr>
             <w:tcW w:w="0" w:type="auto"/>
-            <w:tcBorders>
-              <w:top w:val="single" w:sz="4" w:space="0" w:color="000000"/>
-            </w:tcBorders>
             <w:vAlign w:val="center"/>
           </w:tcPr>
           <w:p>
@@ -8518,9 +9133,6 @@
         <w:tc>
           <w:tcPr>
             <w:tcW w:w="0" w:type="auto"/>
-            <w:tcBorders>
-              <w:top w:val="single" w:sz="4" w:space="0" w:color="000000"/>
-            </w:tcBorders>
             <w:vAlign w:val="center"/>
           </w:tcPr>
           <w:p>
@@ -8540,9 +9152,6 @@
         <w:tc>
           <w:tcPr>
             <w:tcW w:w="0" w:type="auto"/>
-            <w:tcBorders>
-              <w:top w:val="single" w:sz="4" w:space="0" w:color="000000"/>
-            </w:tcBorders>
             <w:vAlign w:val="center"/>
           </w:tcPr>
           <w:p>
@@ -8562,9 +9171,6 @@
         <w:tc>
           <w:tcPr>
             <w:tcW w:w="0" w:type="auto"/>
-            <w:tcBorders>
-              <w:top w:val="single" w:sz="4" w:space="0" w:color="000000"/>
-            </w:tcBorders>
             <w:vAlign w:val="center"/>
           </w:tcPr>
           <w:p>
@@ -8584,9 +9190,6 @@
         <w:tc>
           <w:tcPr>
             <w:tcW w:w="0" w:type="auto"/>
-            <w:tcBorders>
-              <w:top w:val="single" w:sz="4" w:space="0" w:color="000000"/>
-            </w:tcBorders>
             <w:vAlign w:val="center"/>
           </w:tcPr>
           <w:p>
@@ -8606,9 +9209,6 @@
         <w:tc>
           <w:tcPr>
             <w:tcW w:w="0" w:type="auto"/>
-            <w:tcBorders>
-              <w:top w:val="single" w:sz="4" w:space="0" w:color="000000"/>
-            </w:tcBorders>
             <w:vAlign w:val="center"/>
           </w:tcPr>
           <w:p>
@@ -8948,7 +9548,25 @@
         <w:ind w:firstLine="0"/>
       </w:pPr>
       <w:r>
-        <w:t>Both controllers share the planner, filter and plant model (Eq. (2) with LQR gains). Each region–controller pair was flown once (</w:t>
+        <w:t>Both controllers share the planner, filter and plant model (Eq. (</w:t>
+      </w:r>
+      <w:r>
+        <w:fldChar w:fldCharType="begin"/>
+      </w:r>
+      <w:r>
+        <w:instrText xml:space="preserve"> REF _Ref_eq_plant \h \* MERGEFORMAT </w:instrText>
+      </w:r>
+      <w:r>
+        <w:fldChar w:fldCharType="separate"/>
+      </w:r>
+      <w:r>
+        <w:t>2</w:t>
+      </w:r>
+      <w:r>
+        <w:fldChar w:fldCharType="end"/>
+      </w:r>
+      <w:r>
+        <w:t>) with LQR gains). Each region–controller pair was flown once (</w:t>
       </w:r>
       <w:r>
         <w:rPr>
@@ -9013,7 +9631,15 @@
         <w:t>2</w:t>
       </w:r>
       <w:r>
-        <w:t>, and obstacle distance is measured from the drone centre to the cylinder surface; the airframe reaches 0.235 m (body) to 0.348 m (rotor tips), so smaller distances mean certain or possible contact. We also assume a lightweight rotor guard, as on collision-tolerant multirotors [23], so that grazing contacts load the guard rather than the propellers; the guard is not simulated and changes no reported number.</w:t>
+        <w:t>, and obstacle distance is measured from the drone centre to the cylinder surface; the airframe reaches 0.235 m (body) to 0.348 m (rotor tips), so smaller distances mean certain or possible contact. We also assume a lightweight rotor guard, as on collision-tolerant multirotors [</w:t>
+      </w:r>
+      <w:hyperlink w:anchor="_Ref_bib23" w:history="1">
+        <w:r>
+          <w:t>23</w:t>
+        </w:r>
+      </w:hyperlink>
+      <w:r>
+        <w:t>], so that grazing contacts load the guard rather than the propellers; the guard is not simulated and changes no reported number.</w:t>
       </w:r>
     </w:p>
     <w:p>
@@ -9025,7 +9651,7 @@
           <w:noProof/>
         </w:rPr>
         <w:drawing>
-          <wp:inline distT="0" distB="0" distL="0" distR="0" wp14:anchorId="4C8EA2C7" wp14:editId="17077D25">
+          <wp:inline distT="0" distB="0" distL="0" distR="0" wp14:anchorId="312FD059" wp14:editId="1258B310">
             <wp:extent cx="5394960" cy="2220806"/>
             <wp:effectExtent l="0" t="0" r="0" b="0"/>
             <wp:docPr id="5" name="Picture 5"/>
@@ -9070,10 +9696,52 @@
         <w:rPr>
           <w:b/>
         </w:rPr>
-        <w:t>FIGURE 5.</w:t>
-      </w:r>
-      <w:r>
-        <w:t xml:space="preserve"> Flown trajectories of live agents above 0.5 m, including transit from the launch pad (</w:t>
+        <w:t xml:space="preserve">FIGURE </w:t>
+      </w:r>
+      <w:bookmarkStart w:id="12" w:name="_Ref_fig_traj"/>
+      <w:r>
+        <w:rPr>
+          <w:b/>
+        </w:rPr>
+        <w:fldChar w:fldCharType="begin"/>
+      </w:r>
+      <w:r>
+        <w:rPr>
+          <w:b/>
+        </w:rPr>
+        <w:instrText xml:space="preserve"> SEQ Figure \* ARABIC </w:instrText>
+      </w:r>
+      <w:r>
+        <w:rPr>
+          <w:b/>
+        </w:rPr>
+        <w:fldChar w:fldCharType="separate"/>
+      </w:r>
+      <w:r>
+        <w:rPr>
+          <w:b/>
+          <w:noProof/>
+        </w:rPr>
+        <w:t>5</w:t>
+      </w:r>
+      <w:r>
+        <w:rPr>
+          <w:b/>
+        </w:rPr>
+        <w:fldChar w:fldCharType="end"/>
+      </w:r>
+      <w:bookmarkEnd w:id="12"/>
+      <w:r>
+        <w:rPr>
+          <w:b/>
+        </w:rPr>
+        <w:t>.</w:t>
+      </w:r>
+      <w:r>
+        <w:t xml:space="preserve"> </w:t>
+      </w:r>
+      <w:r>
+        <w:t>Flown trajectories of live agents above 0.5 m, including transit from the launch pad (</w:t>
       </w:r>
       <w:r>
         <w:rPr>
@@ -9104,13 +9772,81 @@
     <w:p>
       <w:pPr>
         <w:pStyle w:val="Paragraph"/>
-        <w:ind w:firstLine="0"/>
-      </w:pPr>
-      <w:r>
-        <w:t>Table 2 and Fig. 5 summarise the eight missions. Seven finished with all survivors back at their cell centroids and 96.9–99.0% coverage, despite losing two of seven agents at 18% and 32% coverage. Every obstacle map held all nine cylinders (centre and radius within the 0.1 m log resolution) plus at most two unmatched tracks, and no completed mission needed tier 3. Each kill causes a small drop, as the failed cell’s coverage is erased, before the slope resumes (Fig. 6); Fig. 7 shows the final maps. The PID-L</w:t>
-      </w:r>
-      <w:r>
-        <w:t>QR U-shape mission ended at 96.9% with thin uncovered strips along cell boundaries in the left arm, nearly absent for PID-</w:t>
+      </w:pPr>
+      <w:r>
+        <w:t>Table </w:t>
+      </w:r>
+      <w:r>
+        <w:fldChar w:fldCharType="begin"/>
+      </w:r>
+      <w:r>
+        <w:instrText xml:space="preserve"> REF _Ref_tab_results \h \* MERGEFORMAT </w:instrText>
+      </w:r>
+      <w:r>
+        <w:fldChar w:fldCharType="separate"/>
+      </w:r>
+      <w:r>
+        <w:t>2</w:t>
+      </w:r>
+      <w:r>
+        <w:fldChar w:fldCharType="end"/>
+      </w:r>
+      <w:r>
+        <w:t xml:space="preserve"> and Fig. </w:t>
+      </w:r>
+      <w:r>
+        <w:fldChar w:fldCharType="begin"/>
+      </w:r>
+      <w:r>
+        <w:instrText xml:space="preserve"> REF _Ref_fig_traj \h \* MERGEFORMAT </w:instrText>
+      </w:r>
+      <w:r>
+        <w:fldChar w:fldCharType="separate"/>
+      </w:r>
+      <w:r>
+        <w:t>5</w:t>
+      </w:r>
+      <w:r>
+        <w:fldChar w:fldCharType="end"/>
+      </w:r>
+      <w:r>
+        <w:t xml:space="preserve"> summarise the eight missions. Seven finished with all survivors back at their cell centroids and 96.9–99.0% coverage, despite losing two of seven agents at 18% and 32% coverage. Every obstacle map held all nine cylinders (centre and radius within the 0.1 m log resolution) plus at most two unmatched tracks, and no completed mission needed tier 3. Each kill causes a small drop, as the failed cell’s coverage is erased, before the slope resumes (Fig. </w:t>
+      </w:r>
+      <w:r>
+        <w:fldChar w:fldCharType="begin"/>
+      </w:r>
+      <w:r>
+        <w:instrText xml:space="preserve"> REF _Ref_fig_coverage \h \* MERGEFORMAT </w:instrText>
+      </w:r>
+      <w:r>
+        <w:fldChar w:fldCharType="separate"/>
+      </w:r>
+      <w:r>
+        <w:t>6</w:t>
+      </w:r>
+      <w:r>
+        <w:fldChar w:fldCharType="end"/>
+      </w:r>
+      <w:r>
+        <w:t>); Fig. </w:t>
+      </w:r>
+      <w:r>
+        <w:fldChar w:fldCharType="begin"/>
+      </w:r>
+      <w:r>
+        <w:instrText xml:space="preserve"> REF _Ref_fig_env \h \* MERGEFORMAT </w:instrText>
+      </w:r>
+      <w:r>
+        <w:fldChar w:fldCharType="separate"/>
+      </w:r>
+      <w:r>
+        <w:t>7</w:t>
+      </w:r>
+      <w:r>
+        <w:fldChar w:fldCharType="end"/>
+      </w:r>
+      <w:r>
+        <w:t xml:space="preserve"> shows the final maps. The PID-LQR U-shape mission ended at 96.9% with thin uncovered strips along cell boundaries in the left arm, nearly absent for PID-</w:t>
       </w:r>
       <w:r>
         <w:rPr>
@@ -9138,7 +9874,7 @@
         </w:rPr>
         <w:lastRenderedPageBreak/>
         <w:drawing>
-          <wp:inline distT="0" distB="0" distL="0" distR="0" wp14:anchorId="1558A78C" wp14:editId="052054B2">
+          <wp:inline distT="0" distB="0" distL="0" distR="0" wp14:anchorId="6FDA2049" wp14:editId="1E15888F">
             <wp:extent cx="5394960" cy="1790845"/>
             <wp:effectExtent l="0" t="0" r="0" b="0"/>
             <wp:docPr id="6" name="Picture 6"/>
@@ -9183,7 +9919,46 @@
         <w:rPr>
           <w:b/>
         </w:rPr>
-        <w:t>FIGURE 6.</w:t>
+        <w:t xml:space="preserve">FIGURE </w:t>
+      </w:r>
+      <w:bookmarkStart w:id="13" w:name="_Ref_fig_coverage"/>
+      <w:r>
+        <w:rPr>
+          <w:b/>
+        </w:rPr>
+        <w:fldChar w:fldCharType="begin"/>
+      </w:r>
+      <w:r>
+        <w:rPr>
+          <w:b/>
+        </w:rPr>
+        <w:instrText xml:space="preserve"> SEQ Figure \* ARABIC </w:instrText>
+      </w:r>
+      <w:r>
+        <w:rPr>
+          <w:b/>
+        </w:rPr>
+        <w:fldChar w:fldCharType="separate"/>
+      </w:r>
+      <w:r>
+        <w:rPr>
+          <w:b/>
+          <w:noProof/>
+        </w:rPr>
+        <w:t>6</w:t>
+      </w:r>
+      <w:r>
+        <w:rPr>
+          <w:b/>
+        </w:rPr>
+        <w:fldChar w:fldCharType="end"/>
+      </w:r>
+      <w:bookmarkEnd w:id="13"/>
+      <w:r>
+        <w:rPr>
+          <w:b/>
+        </w:rPr>
+        <w:t>.</w:t>
       </w:r>
       <w:r>
         <w:t xml:space="preserve"> Coverage against mission time (coordinator clock). Triangles: agent kills, after which the failed cell is re-swept.</w:t>
@@ -9198,7 +9973,7 @@
           <w:noProof/>
         </w:rPr>
         <w:drawing>
-          <wp:inline distT="0" distB="0" distL="0" distR="0" wp14:anchorId="445DD1EF" wp14:editId="5E4B8A2D">
+          <wp:inline distT="0" distB="0" distL="0" distR="0" wp14:anchorId="3B248920" wp14:editId="03AD6CCA">
             <wp:extent cx="5394960" cy="1063046"/>
             <wp:effectExtent l="0" t="0" r="0" b="0"/>
             <wp:docPr id="7" name="Picture 7"/>
@@ -9243,10 +10018,52 @@
         <w:rPr>
           <w:b/>
         </w:rPr>
-        <w:t>FIGURE 7.</w:t>
-      </w:r>
-      <w:r>
-        <w:t xml:space="preserve"> (a) Gazebo, rect scenario (screenshot); (b)–(e) final RViz coverage maps (green) of the PID-</w:t>
+        <w:t xml:space="preserve">FIGURE </w:t>
+      </w:r>
+      <w:bookmarkStart w:id="14" w:name="_Ref_fig_env"/>
+      <w:r>
+        <w:rPr>
+          <w:b/>
+        </w:rPr>
+        <w:fldChar w:fldCharType="begin"/>
+      </w:r>
+      <w:r>
+        <w:rPr>
+          <w:b/>
+        </w:rPr>
+        <w:instrText xml:space="preserve"> SEQ Figure \* ARABIC </w:instrText>
+      </w:r>
+      <w:r>
+        <w:rPr>
+          <w:b/>
+        </w:rPr>
+        <w:fldChar w:fldCharType="separate"/>
+      </w:r>
+      <w:r>
+        <w:rPr>
+          <w:b/>
+          <w:noProof/>
+        </w:rPr>
+        <w:t>7</w:t>
+      </w:r>
+      <w:r>
+        <w:rPr>
+          <w:b/>
+        </w:rPr>
+        <w:fldChar w:fldCharType="end"/>
+      </w:r>
+      <w:bookmarkEnd w:id="14"/>
+      <w:r>
+        <w:rPr>
+          <w:b/>
+        </w:rPr>
+        <w:t>.</w:t>
+      </w:r>
+      <w:r>
+        <w:t xml:space="preserve"> </w:t>
+      </w:r>
+      <w:r>
+        <w:t>(a) Gazebo, rect scenario (screenshot); (b)–(e) final RViz coverage maps (green) of the PID-</w:t>
       </w:r>
       <w:r>
         <w:rPr>
@@ -9290,10 +10107,27 @@
     <w:p>
       <w:pPr>
         <w:pStyle w:val="Paragraph"/>
-        <w:ind w:firstLine="0"/>
-      </w:pPr>
-      <w:r>
-        <w:t>The two designs differ clearly in how tightly they hold a lane (Fig. 8a): the median lateral error was 2.7–3.8 cm with PID-</w:t>
+      </w:pPr>
+      <w:r>
+        <w:t>The two designs differ clearly in how tightly they hold a lane (Fig. </w:t>
+      </w:r>
+      <w:r>
+        <w:fldChar w:fldCharType="begin"/>
+      </w:r>
+      <w:r>
+        <w:instrText xml:space="preserve"> REF _Ref_fig_tracking \h \* MERGEFORMAT </w:instrText>
+      </w:r>
+      <w:r>
+        <w:fldChar w:fldCharType="separate"/>
+      </w:r>
+      <w:r>
+        <w:t>8</w:t>
+      </w:r>
+      <w:r>
+        <w:fldChar w:fldCharType="end"/>
+      </w:r>
+      <w:r>
+        <w:t>a): the median lateral error was 2.7–3.8 cm with PID-</w:t>
       </w:r>
       <w:r>
         <w:rPr>
@@ -9308,7 +10142,10 @@
         <w:t>∞</w:t>
       </w:r>
       <w:r>
-        <w:t xml:space="preserve"> and 8.5–8.8 cm with PID-LQR, and the RMS error fell from 11.4–12.2 cm to 7.2–9.7 cm (16–39%) in all four regions. Most of the difference is a mean offset: PID-LQR flew −5.7 to −7.0 cm downwind (towards −</w:t>
+        <w:t xml:space="preserve"> and 8.5–8.8 cm with PID-LQR, and the RMS error fell from 11.4–12.2 cm to 7.2–9.7 cm (16–39%) in all four regions. Most of the difference is a mean offset: PID-LQR flew </w:t>
+      </w:r>
+      <w:r>
+        <w:t>−5.7 to −7.0 cm downwind (towards −</w:t>
       </w:r>
       <w:r>
         <w:rPr>
@@ -9347,7 +10184,25 @@
         <w:t>∞</w:t>
       </w:r>
       <w:r>
-        <w:t xml:space="preserve"> outer integral gain is 3.9 times larger, and the PID-LQR node freezes its position integrator beyond 0.25 m of error, which happened in 36–45% of its sweep samples. Mean sweep speeds of 1.15–1.21 against 1.02–1.12 m/s (command 1.6 m/s) account for the 11–15% shorter missions; the 95th-percentile tilt was essentially equal, as was altitude error outside the two missions with upsets. In the linear analysis (Table 1) the </w:t>
+        <w:t xml:space="preserve"> outer integral gain is 3.9 times larger, and the PID-LQR node freezes its position integrator beyond 0.25 m of error, which happened in 36–45% of its sweep samples. Mean sweep speeds of 1.15–1.21 against 1.02–1.12 m/s (command 1.6 m/s) account for the 11–15% shorter missions; the 95th-percentile tilt was essentially equal, as was altitude error outside the two missions with upsets. In the linear analysis (Table </w:t>
+      </w:r>
+      <w:r>
+        <w:fldChar w:fldCharType="begin"/>
+      </w:r>
+      <w:r>
+        <w:instrText xml:space="preserve"> REF _Ref_tab_gains \h \* MERGEFORMAT </w:instrText>
+      </w:r>
+      <w:r>
+        <w:fldChar w:fldCharType="separate"/>
+      </w:r>
+      <w:r>
+        <w:t>1</w:t>
+      </w:r>
+      <w:r>
+        <w:fldChar w:fldCharType="end"/>
+      </w:r>
+      <w:r>
+        <w:t xml:space="preserve">) the </w:t>
       </w:r>
       <w:r>
         <w:rPr>
@@ -9362,7 +10217,25 @@
         <w:t>∞</w:t>
       </w:r>
       <w:r>
-        <w:t xml:space="preserve"> gains lower the worst-case disturbance-to-position gain by 4.0 times and the position deviation under the Gauss–Markov input by 3.7 times (Fig. 8c).</w:t>
+        <w:t xml:space="preserve"> gains lower the worst-case disturbance-to-position gain by 4.0 times and the position deviation under the Gauss–Markov input by 3.7 times (Fig. </w:t>
+      </w:r>
+      <w:r>
+        <w:fldChar w:fldCharType="begin"/>
+      </w:r>
+      <w:r>
+        <w:instrText xml:space="preserve"> REF _Ref_fig_tracking \h \* MERGEFORMAT </w:instrText>
+      </w:r>
+      <w:r>
+        <w:fldChar w:fldCharType="separate"/>
+      </w:r>
+      <w:r>
+        <w:t>8</w:t>
+      </w:r>
+      <w:r>
+        <w:fldChar w:fldCharType="end"/>
+      </w:r>
+      <w:r>
+        <w:t>c).</w:t>
       </w:r>
     </w:p>
     <w:p>
@@ -9385,7 +10258,25 @@
         <w:t>∞</w:t>
       </w:r>
       <w:r>
-        <w:t xml:space="preserve"> used 3.9–5.6 times the torque effort of PID-LQR (Fig. 8b), with motor saturation below 0.2% of samples, and its outer loop has a higher crossover (9.08 vs 4.09 rad/s) and smaller margins. The measured reduction is far below the linear factor because tilt limit, pre-filter, QP rate limits and wind force model are not in the linear model. As </w:t>
+        <w:t xml:space="preserve"> used 3.9–5.6 times the torque effort of PID-LQR (Fig. </w:t>
+      </w:r>
+      <w:r>
+        <w:fldChar w:fldCharType="begin"/>
+      </w:r>
+      <w:r>
+        <w:instrText xml:space="preserve"> REF _Ref_fig_tracking \h \* MERGEFORMAT </w:instrText>
+      </w:r>
+      <w:r>
+        <w:fldChar w:fldCharType="separate"/>
+      </w:r>
+      <w:r>
+        <w:t>8</w:t>
+      </w:r>
+      <w:r>
+        <w:fldChar w:fldCharType="end"/>
+      </w:r>
+      <w:r>
+        <w:t xml:space="preserve">b), with motor saturation below 0.2% of samples, and its outer loop has a higher crossover (9.08 vs 4.09 rad/s) and smaller margins. The measured reduction is far below the linear factor because tilt limit, pre-filter, QP rate limits and wind force model are not in the linear model. As </w:t>
       </w:r>
       <w:r>
         <w:rPr>
@@ -9426,7 +10317,6 @@
     <w:p>
       <w:pPr>
         <w:pStyle w:val="Paragraph"/>
-        <w:ind w:firstLine="0"/>
       </w:pPr>
       <w:r>
         <w:t>No two agents came closer than 0.79 m (PID-LQR, L-shape), above the 0.70 m hard radius. The minimum surface distance to static cylinders was 0.49, 0.57 and 0.63 m under PID-</w:t>
@@ -9453,7 +10343,25 @@
         <w:t>plus</w:t>
       </w:r>
       <w:r>
-        <w:t xml:space="preserve"> both passed within 0.24 m of the central cylinder, inside the rotor envelope, where the assumed guard takes the contact. The upsets (Fig. 9) share a pattern: each happened while the agent stepped to its next lane beside a cylinder, after 1–4 s of tier-2 solves bound by that cylinder. In the PID-LQR rect mission agent 2 came within 0.06 m of the cylinder at (0,2.5) (body contact), tilted to 155.9° and fell. In </w:t>
+        <w:t xml:space="preserve"> both passed within 0.24 m of the central cylinder, inside the rotor envelope, where the assumed guard takes the contact. The upsets (Fig. </w:t>
+      </w:r>
+      <w:r>
+        <w:fldChar w:fldCharType="begin"/>
+      </w:r>
+      <w:r>
+        <w:instrText xml:space="preserve"> REF _Ref_fig_events \h \* MERGEFORMAT </w:instrText>
+      </w:r>
+      <w:r>
+        <w:fldChar w:fldCharType="separate"/>
+      </w:r>
+      <w:r>
+        <w:t>9</w:t>
+      </w:r>
+      <w:r>
+        <w:fldChar w:fldCharType="end"/>
+      </w:r>
+      <w:r>
+        <w:t xml:space="preserve">) share a pattern: each happened while the agent stepped to its next lane beside a cylinder, after 1–4 s of tier-2 solves bound by that cylinder. In the PID-LQR rect mission agent 2 came within 0.06 m of the cylinder at (0,2.5) (body contact), tilted to 155.9° and fell. In </w:t>
       </w:r>
       <w:r>
         <w:rPr>
@@ -9462,10 +10370,7 @@
         <w:t>plus</w:t>
       </w:r>
       <w:r>
-        <w:t>, agent 2 of both missions grazed the central cylinder, tilting to 40.1° (PID-LQR) and 82.5</w:t>
-      </w:r>
-      <w:r>
-        <w:t>° (PID-</w:t>
+        <w:t>, agent 2 of both missions grazed the central cylinder, tilting to 40.1° (PID-LQR) and 82.5° (PID-</w:t>
       </w:r>
       <w:r>
         <w:rPr>
@@ -9502,7 +10407,7 @@
         </w:rPr>
         <w:lastRenderedPageBreak/>
         <w:drawing>
-          <wp:inline distT="0" distB="0" distL="0" distR="0" wp14:anchorId="1300BDB6" wp14:editId="1E7AAF09">
+          <wp:inline distT="0" distB="0" distL="0" distR="0" wp14:anchorId="2F3344E5" wp14:editId="5CE6D1EB">
             <wp:extent cx="4297680" cy="1485022"/>
             <wp:effectExtent l="0" t="0" r="0" b="0"/>
             <wp:docPr id="8" name="Picture 8"/>
@@ -9547,7 +10452,46 @@
         <w:rPr>
           <w:b/>
         </w:rPr>
-        <w:t>FIGURE 8.</w:t>
+        <w:t xml:space="preserve">FIGURE </w:t>
+      </w:r>
+      <w:bookmarkStart w:id="15" w:name="_Ref_fig_tracking"/>
+      <w:r>
+        <w:rPr>
+          <w:b/>
+        </w:rPr>
+        <w:fldChar w:fldCharType="begin"/>
+      </w:r>
+      <w:r>
+        <w:rPr>
+          <w:b/>
+        </w:rPr>
+        <w:instrText xml:space="preserve"> SEQ Figure \* ARABIC </w:instrText>
+      </w:r>
+      <w:r>
+        <w:rPr>
+          <w:b/>
+        </w:rPr>
+        <w:fldChar w:fldCharType="separate"/>
+      </w:r>
+      <w:r>
+        <w:rPr>
+          <w:b/>
+          <w:noProof/>
+        </w:rPr>
+        <w:t>8</w:t>
+      </w:r>
+      <w:r>
+        <w:rPr>
+          <w:b/>
+        </w:rPr>
+        <w:fldChar w:fldCharType="end"/>
+      </w:r>
+      <w:bookmarkEnd w:id="15"/>
+      <w:r>
+        <w:rPr>
+          <w:b/>
+        </w:rPr>
+        <w:t>.</w:t>
       </w:r>
       <w:r>
         <w:t xml:space="preserve"> </w:t>
@@ -9565,7 +10509,7 @@
           <w:noProof/>
         </w:rPr>
         <w:drawing>
-          <wp:inline distT="0" distB="0" distL="0" distR="0" wp14:anchorId="63999D6C" wp14:editId="17391812">
+          <wp:inline distT="0" distB="0" distL="0" distR="0" wp14:anchorId="1E0FFE36" wp14:editId="66982F49">
             <wp:extent cx="4297680" cy="1730268"/>
             <wp:effectExtent l="0" t="0" r="0" b="0"/>
             <wp:docPr id="9" name="Picture 9"/>
@@ -9610,7 +10554,46 @@
         <w:rPr>
           <w:b/>
         </w:rPr>
-        <w:t>FIGURE 9.</w:t>
+        <w:t xml:space="preserve">FIGURE </w:t>
+      </w:r>
+      <w:bookmarkStart w:id="16" w:name="_Ref_fig_events"/>
+      <w:r>
+        <w:rPr>
+          <w:b/>
+        </w:rPr>
+        <w:fldChar w:fldCharType="begin"/>
+      </w:r>
+      <w:r>
+        <w:rPr>
+          <w:b/>
+        </w:rPr>
+        <w:instrText xml:space="preserve"> SEQ Figure \* ARABIC </w:instrText>
+      </w:r>
+      <w:r>
+        <w:rPr>
+          <w:b/>
+        </w:rPr>
+        <w:fldChar w:fldCharType="separate"/>
+      </w:r>
+      <w:r>
+        <w:rPr>
+          <w:b/>
+          <w:noProof/>
+        </w:rPr>
+        <w:t>9</w:t>
+      </w:r>
+      <w:r>
+        <w:rPr>
+          <w:b/>
+        </w:rPr>
+        <w:fldChar w:fldCharType="end"/>
+      </w:r>
+      <w:bookmarkEnd w:id="16"/>
+      <w:r>
+        <w:rPr>
+          <w:b/>
+        </w:rPr>
+        <w:t>.</w:t>
       </w:r>
       <w:r>
         <w:t xml:space="preserve"> Upsets aligned at peak tilt: surface distance to the nearest static cylinder (dark: body contact; light: rotor contact possible), tilt (dotted: 25° level-out) and altitude. (a) PID-LQR, rect, agent 2: contact and loss. (b) </w:t>
@@ -9648,7 +10631,6 @@
     <w:p>
       <w:pPr>
         <w:pStyle w:val="Paragraph"/>
-        <w:ind w:firstLine="0"/>
       </w:pPr>
       <w:r>
         <w:t>The results rest on one run per configuration (fixed wind seed), perfect state feedback and moving-obstacle tracking, instantaneous failure detection, geometric coverage, assumed but unsimulated rotor guards and centralised upper layers; no ablation or re-implemented baseline.</w:t>
@@ -9665,7 +10647,6 @@
     <w:p>
       <w:pPr>
         <w:pStyle w:val="Paragraph"/>
-        <w:ind w:firstLine="0"/>
       </w:pPr>
       <w:r>
         <w:t xml:space="preserve">A three-layer architecture of polygon-clipped Voronoi partitioning, boundary-following sweeps, lane-level fault reallocation, a LiDAR-mapped actuator-consistent CBF-QP and Riccati-synthesised PID control completed seven of eight simulated missions with 96.9–99.0% coverage under turbulence, unmapped and moving obstacles, and the loss of two of seven quadrotors. </w:t>
@@ -9697,7 +10678,6 @@
     <w:p>
       <w:pPr>
         <w:pStyle w:val="Paragraph"/>
-        <w:ind w:firstLine="0"/>
       </w:pPr>
       <w:r>
         <w:t>The authors thank the Center for Instrumentation Technology and Automation, Institut Teknologi Bandung, for covering the conference registration and publication fees of this paper.</w:t>
@@ -9716,126 +10696,157 @@
       <w:pPr>
         <w:pStyle w:val="Reference"/>
       </w:pPr>
+      <w:bookmarkStart w:id="17" w:name="_Ref_bib1"/>
       <w:r>
         <w:t>S. P. Lloyd, “Least squares quantization in PCM,” IEEE Trans. Inf. Theory 28, 129–137 (1982).</w:t>
       </w:r>
+      <w:bookmarkEnd w:id="17"/>
     </w:p>
     <w:p>
       <w:pPr>
         <w:pStyle w:val="Reference"/>
       </w:pPr>
+      <w:bookmarkStart w:id="18" w:name="_Ref_bib2"/>
       <w:r>
         <w:t>Y. Bai, Y. Wang, M. Svinin, E. Magid, and R. Sun, “Adaptive multi-agent coverage control with obstacle avoidance,” IEEE Control Syst. Lett. 6, 944–949 (2022).</w:t>
       </w:r>
+      <w:bookmarkEnd w:id="18"/>
     </w:p>
     <w:p>
       <w:pPr>
         <w:pStyle w:val="Reference"/>
       </w:pPr>
+      <w:bookmarkStart w:id="19" w:name="_Ref_bib3"/>
       <w:r>
         <w:t>Y. Bai, Y. Wang, X. Xiong, J. Song, and M. M. Svinin, “Safe adaptive multi-agent coverage control,” IEEE Control Syst. Lett. 7, 3217–3222 (2023).</w:t>
       </w:r>
+      <w:bookmarkEnd w:id="19"/>
     </w:p>
     <w:p>
       <w:pPr>
         <w:pStyle w:val="Reference"/>
       </w:pPr>
+      <w:bookmarkStart w:id="20" w:name="_Ref_bib4"/>
       <w:r>
         <w:t>K. Cao, Y. Chen, S. Gao, H. Dang, and D. An, “Distributed weighted coverage for multi-robot systems in non-convex environment,” Appl. Sci. 13, 8530 (2023).</w:t>
       </w:r>
+      <w:bookmarkEnd w:id="20"/>
     </w:p>
     <w:p>
       <w:pPr>
         <w:pStyle w:val="Reference"/>
       </w:pPr>
+      <w:bookmarkStart w:id="21" w:name="_Ref_bib5"/>
       <w:r>
         <w:t>K. Lee and K. Lee, “Adaptive centroidal Voronoi tessellation with agent dropout and reinsertion for multi-agent non-convex area coverage,” IEEE Access 12, 5503–5516 (2024).</w:t>
       </w:r>
+      <w:bookmarkEnd w:id="21"/>
     </w:p>
     <w:p>
       <w:pPr>
         <w:pStyle w:val="Reference"/>
       </w:pPr>
+      <w:bookmarkStart w:id="22" w:name="_Ref_bib6"/>
       <w:r>
         <w:t>C. S. Tan, R. Mohd-Mokhtar, and M. R. Arshad, “A comprehensive review of coverage path planning in robotics using classical and heuristic algorithms,” IEEE Access 9, 119310–119342 (2021).</w:t>
       </w:r>
+      <w:bookmarkEnd w:id="22"/>
     </w:p>
     <w:p>
       <w:pPr>
         <w:pStyle w:val="Reference"/>
       </w:pPr>
+      <w:bookmarkStart w:id="23" w:name="_Ref_bib7"/>
       <w:r>
         <w:t>S. Hu, T. Xu, and B. Wang, “Route-planning method for plant protection rotor drones in convex polygon regions,” Sensors 21, 2221 (2021).</w:t>
       </w:r>
+      <w:bookmarkEnd w:id="23"/>
     </w:p>
     <w:p>
       <w:pPr>
         <w:pStyle w:val="Reference"/>
       </w:pPr>
+      <w:bookmarkStart w:id="24" w:name="_Ref_bib8"/>
       <w:r>
         <w:t>G. Fevgas, T. Lagkas, V. Argyriou, and P. Sarigiannidis, “Coverage path planning methods focusing on energy efficient and cooperative strategies for unmanned aerial vehicles,” Sensors 22, 1235 (2022).</w:t>
       </w:r>
+      <w:bookmarkEnd w:id="24"/>
     </w:p>
     <w:p>
       <w:pPr>
         <w:pStyle w:val="Reference"/>
       </w:pPr>
+      <w:bookmarkStart w:id="25" w:name="_Ref_bib9"/>
       <w:r>
         <w:t>M. A. Luna, M. Molina, R. Da-Silva-Gomez, J. Melero-Deza, P. Arias-Perez, and P. Campoy, “A multi-UAV system for coverage path planning applications with in-flight re-planning capabilities,” J. Field Robot. 41, 1480–1497 (2024).</w:t>
       </w:r>
+      <w:bookmarkEnd w:id="25"/>
     </w:p>
     <w:p>
       <w:pPr>
         <w:pStyle w:val="Reference"/>
       </w:pPr>
+      <w:bookmarkStart w:id="26" w:name="_Ref_bib10"/>
       <w:r>
         <w:t>A. D. Ames, X. Xu, J. W. Grizzle, and P. Tabuada, “Control barrier function based quadratic programs for safety critical systems,” IEEE Trans. Autom. Control 62, 3861–3876 (2017).</w:t>
       </w:r>
+      <w:bookmarkEnd w:id="26"/>
     </w:p>
     <w:p>
       <w:pPr>
         <w:pStyle w:val="Reference"/>
       </w:pPr>
+      <w:bookmarkStart w:id="27" w:name="_Ref_bib11"/>
       <w:r>
         <w:t>K.-C. Hsu, H. Hu, and J. F. Fisac, “The safety filter: A unified view of safety-critical control in autonomous systems,” Annu. Rev. Control Robot. Auton. Syst. 7, 47–72 (2024).</w:t>
       </w:r>
+      <w:bookmarkEnd w:id="27"/>
     </w:p>
     <w:p>
       <w:pPr>
         <w:pStyle w:val="Reference"/>
       </w:pPr>
+      <w:bookmarkStart w:id="28" w:name="_Ref_bib12"/>
       <w:r>
         <w:t>W. Xiao and C. Belta, “High-order control barrier functions,” IEEE Trans. Autom. Control 67, 3655–3662 (2022).</w:t>
       </w:r>
+      <w:bookmarkEnd w:id="28"/>
     </w:p>
     <w:p>
       <w:pPr>
         <w:pStyle w:val="Reference"/>
       </w:pPr>
+      <w:bookmarkStart w:id="29" w:name="_Ref_bib13"/>
       <w:r>
         <w:t>K. Garg, S. Zhang, O. So, C. Dawson, and C. Fan, “Learning safe control for multi-robot systems: Methods, verification, and open challenges,” Annu. Rev. Control 57, 100948 (2024).</w:t>
       </w:r>
+      <w:bookmarkEnd w:id="29"/>
     </w:p>
     <w:p>
       <w:pPr>
         <w:pStyle w:val="Reference"/>
       </w:pPr>
+      <w:bookmarkStart w:id="30" w:name="_Ref_bib14"/>
       <w:r>
         <w:t>M. Tayal, R. Singh, J. Keshavan, and S. Kolathaya, “Control barrier functions in dynamic UAVs for kinematic obstacle avoidance: A collision cone approach,” in 2024 American Control Conference (ACC) (Toronto, Canada, 2024) pp. 3722–3727.</w:t>
       </w:r>
+      <w:bookmarkEnd w:id="30"/>
     </w:p>
     <w:p>
       <w:pPr>
         <w:pStyle w:val="Reference"/>
       </w:pPr>
+      <w:bookmarkStart w:id="31" w:name="_Ref_bib15"/>
       <w:r>
         <w:t>P. Abichandani, D. Lobo, M. Muralidharan, N. Runk, W. McIntyre, D. Bucci, and H. Benson, “Distributed motion planning for multiple quadrotors in presence of wind gusts,” Drones 7, 58 (2023).</w:t>
       </w:r>
+      <w:bookmarkEnd w:id="31"/>
     </w:p>
     <w:p>
       <w:pPr>
         <w:pStyle w:val="Reference"/>
       </w:pPr>
+      <w:bookmarkStart w:id="32" w:name="_Ref_bib16"/>
       <w:r>
         <w:t xml:space="preserve">J. C. Doyle, K. Glover, P. P. Khargonekar, and B. A. Francis, “State-space solutions to standard </w:t>
       </w:r>
@@ -9869,62 +10880,77 @@
       <w:r>
         <w:t xml:space="preserve"> control problems,” IEEE Trans. Autom. Control 34, 831–847 (1989).</w:t>
       </w:r>
+      <w:bookmarkEnd w:id="32"/>
     </w:p>
     <w:p>
       <w:pPr>
         <w:pStyle w:val="Reference"/>
       </w:pPr>
+      <w:bookmarkStart w:id="33" w:name="_Ref_bib17"/>
       <w:r>
         <w:t>Z. Zyadat, N. Horri, M. Innocente, and T. Statheros, “Observer-based optimal control of a quadplane with active wind disturbance and actuator fault rejection,” Sensors 23, 1954 (2023).</w:t>
       </w:r>
+      <w:bookmarkEnd w:id="33"/>
     </w:p>
     <w:p>
       <w:pPr>
         <w:pStyle w:val="Reference"/>
       </w:pPr>
+      <w:bookmarkStart w:id="34" w:name="_Ref_bib18"/>
       <w:r>
         <w:t>J. O’Keeffe, “Anticipating degradation: A predictive approach to fault tolerance in robot swarms,” IEEE Robot. Autom. Lett. 10, 8954–8961 (2025).</w:t>
       </w:r>
+      <w:bookmarkEnd w:id="34"/>
     </w:p>
     <w:p>
       <w:pPr>
         <w:pStyle w:val="Reference"/>
       </w:pPr>
+      <w:bookmarkStart w:id="35" w:name="_Ref_bib19"/>
       <w:r>
         <w:t>I. A. Herdian, E. Ekawati, F. Mukhlish, and P. Prabaswara, “Decentralized formation control system design for swarm quadcopters using an improved artificial potential field and event-based reconfiguration control,” J. King Saud Univ. Eng. Sci. 38, 41 (2026).</w:t>
       </w:r>
+      <w:bookmarkEnd w:id="35"/>
     </w:p>
     <w:p>
       <w:pPr>
         <w:pStyle w:val="Reference"/>
       </w:pPr>
+      <w:bookmarkStart w:id="36" w:name="_Ref_bib20"/>
       <w:r>
         <w:t>S. Macenski, T. Foote, B. Gerkey, C. Lalancette, and W. Woodall, “Robot operating system 2: Design, architecture, and uses in the wild,” Sci. Robot. 7, eabm6074 (2022).</w:t>
       </w:r>
+      <w:bookmarkEnd w:id="36"/>
     </w:p>
     <w:p>
       <w:pPr>
         <w:pStyle w:val="Reference"/>
       </w:pPr>
+      <w:bookmarkStart w:id="37" w:name="_Ref_bib21"/>
       <w:r>
         <w:t>N. Koenig and A. Howard, “Design and use paradigms for Gazebo, an open-source multi-robot simulator,” in 2004 IEEE/RSJ International Conference on Intelligent Robots and Systems (IROS), Vol. 3 (Sendai, Japan, 2004) pp. 2149–2154.</w:t>
       </w:r>
+      <w:bookmarkEnd w:id="37"/>
     </w:p>
     <w:p>
       <w:pPr>
         <w:pStyle w:val="Reference"/>
       </w:pPr>
+      <w:bookmarkStart w:id="38" w:name="_Ref_bib22"/>
       <w:r>
         <w:t>A. Miranda-Moya, H. Castañeda, and H. Wang, “Fixed-time extended observer-based adaptive sliding mode control for a quadrotor UAV under severe turbulent wind,” Drones 7, 700 (2023).</w:t>
       </w:r>
+      <w:bookmarkEnd w:id="38"/>
     </w:p>
     <w:p>
       <w:pPr>
         <w:pStyle w:val="Reference"/>
       </w:pPr>
+      <w:bookmarkStart w:id="39" w:name="_Ref_bib23"/>
       <w:r>
         <w:t>P. De Petris, H. Nguyen, M. Dharmadhikari, M. Kulkarni, N. Khedekar, F. Mascarich, and K. Alexis, “RMF-Owl: A collision- tolerant flying robot for autonomous subterranean exploration,” in 2022 International Conference on Unmanned Aircraft Systems (ICUAS) (2022) pp. 536–543.</w:t>
       </w:r>
+      <w:bookmarkEnd w:id="39"/>
     </w:p>
     <w:sectPr>
       <w:pgSz w:w="12240" w:h="15840"/>

</xml_diff>